<commit_message>
Update Mau 22 and make notice number optional
</commit_message>
<xml_diff>
--- a/research/notice_template/MAU_22_THONG_BAO_XAC_NHAN_KET_QUA_DANG_KY_DAT_DAI.docx
+++ b/research/notice_template/MAU_22_THONG_BAO_XAC_NHAN_KET_QUA_DANG_KY_DAT_DAI.docx
@@ -621,7 +621,7 @@
         <w:rPr>
           <w:sz w:val="28"/>
         </w:rPr>
-        <w:t xml:space="preserve">sử dụng riêng: {{SU_DUNG_RIENG}} m2;</w:t>
+        <w:t>sử dụng riêng: {{SU_DUNG_RIENG}} m2;</w:t>
       </w:r>
     </w:p>
     <w:p>
@@ -743,6 +743,10 @@
         <w:t xml:space="preserve">h) Có quyền hoặc hạn chế quyền đối với thửa đất liền kề số </w:t>
       </w:r>
       <w:r>
+        <w:rPr>
+          <w:sz w:val="28"/>
+          <w:szCs w:val="28"/>
+        </w:rPr>
         <w:t>{{THUA_LIEN_KE}}</w:t>
       </w:r>
       <w:r>
@@ -753,16 +757,24 @@
         <w:t xml:space="preserve">, tờ bản đồ số </w:t>
       </w:r>
       <w:r>
-        <w:t>{{TO_LIEN_KE}}</w:t>
-      </w:r>
-      <w:r>
-        <w:rPr>
-          <w:sz w:val="28"/>
-          <w:szCs w:val="28"/>
-        </w:rPr>
-        <w:t xml:space="preserve">, của </w:t>
-      </w:r>
-      <w:r>
+        <w:rPr>
+          <w:sz w:val="28"/>
+          <w:szCs w:val="28"/>
+        </w:rPr>
+        <w:t>{{TO_LIEN_KE}},</w:t>
+      </w:r>
+      <w:r>
+        <w:rPr>
+          <w:sz w:val="28"/>
+          <w:szCs w:val="28"/>
+        </w:rPr>
+        <w:t xml:space="preserve"> của </w:t>
+      </w:r>
+      <w:r>
+        <w:rPr>
+          <w:sz w:val="28"/>
+          <w:szCs w:val="28"/>
+        </w:rPr>
         <w:t>{{CHU_SU_HUU_LIEN_KE}}</w:t>
       </w:r>
       <w:r>

</xml_diff>